<commit_message>
update logos and initial push
</commit_message>
<xml_diff>
--- a/project documents/Instructions.docx
+++ b/project documents/Instructions.docx
@@ -61,7 +61,7 @@
     <w:p>
       <w:r>
         <w:pict w14:anchorId="7682FA18">
-          <v:rect id="_x0000_i1376" style="width:0;height:1.5pt" o:hralign="center" o:hrstd="t" o:hr="t" fillcolor="#a0a0a0" stroked="f"/>
+          <v:rect id="_x0000_i1025" style="width:0;height:1.5pt" o:hralign="center" o:hrstd="t" o:hr="t" fillcolor="#a0a0a0" stroked="f"/>
         </w:pict>
       </w:r>
     </w:p>
@@ -336,7 +336,7 @@
       <w:r>
         <w:lastRenderedPageBreak/>
         <w:pict w14:anchorId="19C168D3">
-          <v:rect id="_x0000_i1377" style="width:0;height:1.5pt" o:hralign="center" o:hrstd="t" o:hr="t" fillcolor="#a0a0a0" stroked="f"/>
+          <v:rect id="_x0000_i1026" style="width:0;height:1.5pt" o:hralign="center" o:hrstd="t" o:hr="t" fillcolor="#a0a0a0" stroked="f"/>
         </w:pict>
       </w:r>
     </w:p>
@@ -588,7 +588,7 @@
     <w:p>
       <w:r>
         <w:pict w14:anchorId="2BDF351B">
-          <v:rect id="_x0000_i1378" style="width:0;height:1.5pt" o:hralign="center" o:hrstd="t" o:hr="t" fillcolor="#a0a0a0" stroked="f"/>
+          <v:rect id="_x0000_i1027" style="width:0;height:1.5pt" o:hralign="center" o:hrstd="t" o:hr="t" fillcolor="#a0a0a0" stroked="f"/>
         </w:pict>
       </w:r>
     </w:p>
@@ -1429,7 +1429,7 @@
     <w:p>
       <w:r>
         <w:pict w14:anchorId="2D05071B">
-          <v:rect id="_x0000_i1379" style="width:0;height:1.5pt" o:hralign="center" o:hrstd="t" o:hr="t" fillcolor="#a0a0a0" stroked="f"/>
+          <v:rect id="_x0000_i1028" style="width:0;height:1.5pt" o:hralign="center" o:hrstd="t" o:hr="t" fillcolor="#a0a0a0" stroked="f"/>
         </w:pict>
       </w:r>
     </w:p>
@@ -1590,7 +1590,7 @@
     <w:p>
       <w:r>
         <w:pict w14:anchorId="34EE566C">
-          <v:rect id="_x0000_i1380" style="width:0;height:1.5pt" o:hralign="center" o:hrstd="t" o:hr="t" fillcolor="#a0a0a0" stroked="f"/>
+          <v:rect id="_x0000_i1029" style="width:0;height:1.5pt" o:hralign="center" o:hrstd="t" o:hr="t" fillcolor="#a0a0a0" stroked="f"/>
         </w:pict>
       </w:r>
     </w:p>
@@ -1963,7 +1963,7 @@
     <w:p>
       <w:r>
         <w:pict w14:anchorId="36764F3E">
-          <v:rect id="_x0000_i1381" style="width:0;height:1.5pt" o:hralign="center" o:hrstd="t" o:hr="t" fillcolor="#a0a0a0" stroked="f"/>
+          <v:rect id="_x0000_i1030" style="width:0;height:1.5pt" o:hralign="center" o:hrstd="t" o:hr="t" fillcolor="#a0a0a0" stroked="f"/>
         </w:pict>
       </w:r>
     </w:p>
@@ -2127,7 +2127,7 @@
     <w:p>
       <w:r>
         <w:pict w14:anchorId="73CAC77A">
-          <v:rect id="_x0000_i1382" style="width:0;height:1.5pt" o:hralign="center" o:hrstd="t" o:hr="t" fillcolor="#a0a0a0" stroked="f"/>
+          <v:rect id="_x0000_i1031" style="width:0;height:1.5pt" o:hralign="center" o:hrstd="t" o:hr="t" fillcolor="#a0a0a0" stroked="f"/>
         </w:pict>
       </w:r>
     </w:p>
@@ -2313,7 +2313,7 @@
     <w:p>
       <w:r>
         <w:pict w14:anchorId="455377E0">
-          <v:rect id="_x0000_i1383" style="width:0;height:1.5pt" o:hralign="center" o:hrstd="t" o:hr="t" fillcolor="#a0a0a0" stroked="f"/>
+          <v:rect id="_x0000_i1032" style="width:0;height:1.5pt" o:hralign="center" o:hrstd="t" o:hr="t" fillcolor="#a0a0a0" stroked="f"/>
         </w:pict>
       </w:r>
     </w:p>
@@ -2509,7 +2509,7 @@
     <w:p>
       <w:r>
         <w:pict w14:anchorId="2E2A9D39">
-          <v:rect id="_x0000_i1384" style="width:0;height:1.5pt" o:hralign="center" o:hrstd="t" o:hr="t" fillcolor="#a0a0a0" stroked="f"/>
+          <v:rect id="_x0000_i1033" style="width:0;height:1.5pt" o:hralign="center" o:hrstd="t" o:hr="t" fillcolor="#a0a0a0" stroked="f"/>
         </w:pict>
       </w:r>
     </w:p>
@@ -2731,7 +2731,7 @@
     <w:p>
       <w:r>
         <w:pict w14:anchorId="33DE6D2C">
-          <v:rect id="_x0000_i1385" style="width:0;height:1.5pt" o:hralign="center" o:hrstd="t" o:hr="t" fillcolor="#a0a0a0" stroked="f"/>
+          <v:rect id="_x0000_i1034" style="width:0;height:1.5pt" o:hralign="center" o:hrstd="t" o:hr="t" fillcolor="#a0a0a0" stroked="f"/>
         </w:pict>
       </w:r>
     </w:p>
@@ -11788,6 +11788,7 @@
   <w:style w:type="character" w:default="1" w:styleId="DefaultParagraphFont">
     <w:name w:val="Default Paragraph Font"/>
     <w:uiPriority w:val="1"/>
+    <w:semiHidden/>
     <w:unhideWhenUsed/>
   </w:style>
   <w:style w:type="table" w:default="1" w:styleId="TableNormal">

</xml_diff>